<commit_message>
Tighten bio: drop KBS mention, use full year for ICAIF
</commit_message>
<xml_diff>
--- a/이력서_및_경력기술서_김남형.docx
+++ b/이력서_및_경력기술서_김남형.docx
@@ -139,7 +139,7 @@
         </w:rPr>
         <w:t xml:space="preserve">  </w:t>
       </w:r>
-      <w:hyperlink w:history="1" r:id="rIdgjgsnf8w5r74kfv6d_mza">
+      <w:hyperlink w:history="1" r:id="rIdrnsgtstfezf85cbabf0m1">
         <w:r>
           <w:rPr>
             <w:rFonts w:ascii="Arial" w:cs="Arial" w:eastAsia="Malgun Gothic" w:hAnsi="Arial"/>
@@ -176,7 +176,7 @@
         </w:rPr>
         <w:t xml:space="preserve">  </w:t>
       </w:r>
-      <w:hyperlink w:history="1" r:id="rIdozbnqz4mtktp73imsae8s">
+      <w:hyperlink w:history="1" r:id="rIdwrv0lqceks3em7yy7pfui">
         <w:r>
           <w:rPr>
             <w:rFonts w:ascii="Arial" w:cs="Arial" w:eastAsia="Malgun Gothic" w:hAnsi="Arial"/>
@@ -213,7 +213,7 @@
         </w:rPr>
         <w:t xml:space="preserve">  </w:t>
       </w:r>
-      <w:hyperlink w:history="1" r:id="rIdht6qlgndasu_-eihwxtct">
+      <w:hyperlink w:history="1" r:id="rId39oqikctrakr-jo7b_h5l">
         <w:r>
           <w:rPr>
             <w:rFonts w:ascii="Arial" w:cs="Arial" w:eastAsia="Malgun Gothic" w:hAnsi="Arial"/>
@@ -1207,7 +1207,7 @@
           <w:sz w:val="20"/>
           <w:szCs w:val="20"/>
         </w:rPr>
-        <w:t xml:space="preserve">· Kim, Namhyoung, Jae Wook Song. "Vector-Quantized Discrete Latent Factors Meet Financial Priors: Dynamic Cross-Sectional Stock Ranking Prediction for Portfolio Construction." Proceedings of the 35th International Joint Conference on Artificial Intelligence (IJCAI '26), 2026. (Accepted, To appear)</w:t>
+        <w:t xml:space="preserve">· Kim, Namhyoung, Jae Wook Song. "Vector-Quantized Discrete Latent Factors Meet Financial Priors: Dynamic Cross-Sectional Stock Ranking Prediction for Portfolio Construction." Proceedings of the 35th International Joint Conference on Artificial Intelligence (IJCAI-ECAI 2026). (Accepted, To appear)</w:t>
       </w:r>
     </w:p>
     <w:p>
@@ -2823,7 +2823,7 @@
           <w:sz w:val="20"/>
           <w:szCs w:val="20"/>
         </w:rPr>
-        <w:t xml:space="preserve">IJCAI 2026 Accepted (To appear)</w:t>
+        <w:t xml:space="preserve">IJCAI-ECAI 2026 Accepted (To appear)</w:t>
       </w:r>
     </w:p>
     <w:p>
@@ -2925,7 +2925,7 @@
           <w:sz w:val="18"/>
           <w:szCs w:val="18"/>
         </w:rPr>
-        <w:t xml:space="preserve">IJCAI 2026 (To appear), CIKM-W 2025 (Seoul) 발표 — "FPQ-VAE", KAFO 2025 발표 — "PRISM-VQ"</w:t>
+        <w:t xml:space="preserve">IJCAI-ECAI 2026 (To appear), CIKM-W 2025 (Seoul) 발표 — "FPQ-VAE", KAFO 2025 발표 — "PRISM-VQ"</w:t>
       </w:r>
     </w:p>
     <w:p>

</xml_diff>